<commit_message>
Tender status: chat row updated for voice messages and inline media
Co-Authored-By: Claude Opus 5 (1M context) <noreply@anthropic.com>
</commit_message>
<xml_diff>
--- a/mobile mncardio - гүйцэтгэл 2026-09-15.docx
+++ b/mobile mncardio - гүйцэтгэл 2026-09-15.docx
@@ -25,7 +25,7 @@
           <w:color w:val="555555"/>
           <w:sz w:val="19"/>
         </w:rPr>
-        <w:t>"Техникийн тодорхойлолт, тавигдах шаардлага"-ын дагуу · 2026-09-15-ны байдлаар (апп талын ажлын дараа) · Гүйцэтгэгч: ITsystem</w:t>
+        <w:t>"Техникийн тодорхойлолт, тавигдах шаардлага"-ын дагуу · 2026-09-15-ны байдлаар · Гүйцэтгэгч: ITsystem</w:t>
       </w:r>
     </w:p>
     <w:tbl>
@@ -4968,7 +4968,7 @@
                 <w:sz w:val="17"/>
               </w:rPr>
               <w:br/>
-              <w:t>Ганцаарчилсан ба бүлгийн чат, зураг, файл, дуу бичлэг. Мессеж давхардах, токен дуусах зэрэг 5 алдааг зассан, "бичиж байна" ажиллаж эхэлсэн. Дуу, видеог татаж тоглуулна.</w:t>
+              <w:t>Ганцаарчилсан ба бүлгийн чат. Микрофоноор дуут мессеж бичиж илгээнэ, зураг, дуу, видео мессеж дотроо шууд харагдаж, сонсогдоно. Мессеж давхардах, токен дуусах зэрэг 5 алдааг зассан, "бичиж байна" ажиллаж эхэлсэн.</w:t>
             </w:r>
           </w:p>
         </w:tc>
@@ -5056,7 +5056,7 @@
                 <w:sz w:val="17"/>
               </w:rPr>
               <w:br/>
-              <w:t>Чат, эмчийн зөвлөгөө, эмчээс асуух асуулт бүгдэд зураг, дуу бичлэг, баримт хавсаргана.</w:t>
+              <w:t>Чат, эмчийн зөвлөгөө, эмчээс асуух асуулт бүгдэд зураг, дуу бичлэг, баримт хавсаргана. Хавсралт татахгүйгээр шууд харагдана.</w:t>
             </w:r>
           </w:p>
         </w:tc>

</xml_diff>